<commit_message>
Round 11c: align the submission front matter and planning documents
</commit_message>
<xml_diff>
--- a/重构版论文_v4_20260915/P0_P1执行手册.docx
+++ b/重构版论文_v4_20260915/P0_P1执行手册.docx
@@ -9,6 +9,112 @@
       </w:pPr>
       <w:r>
         <w:t>P0 / P1 执行手册</w:t>
+      </w:r>
+    </w:p>
+    <w:p>
+      <w:r>
+        <w:t xml:space="preserve">&gt; </w:t>
+      </w:r>
+      <w:r>
+        <w:rPr>
+          <w:b/>
+        </w:rPr>
+        <w:t>状态说明（2026-09-17 更新）</w:t>
+      </w:r>
+    </w:p>
+    <w:p>
+      <w:r>
+        <w:t>&gt;</w:t>
+      </w:r>
+    </w:p>
+    <w:p>
+      <w:r>
+        <w:t xml:space="preserve">&gt; 本文档是 </w:t>
+      </w:r>
+      <w:r>
+        <w:rPr>
+          <w:b/>
+        </w:rPr>
+        <w:t>2026-09-15 的审计快照</w:t>
+      </w:r>
+      <w:r>
+        <w:t>，保留当时的判断、命令与优先级，便于追溯"为什么要做这些事"。</w:t>
+      </w:r>
+    </w:p>
+    <w:p>
+      <w:r>
+        <w:t>&gt; 截至当前版本，快照中列出的 P0/P1 缺口与阶段 1–3 的任务已绝大部分完成（少数为作者信息与期刊模板这类外部输入）。</w:t>
+      </w:r>
+    </w:p>
+    <w:p>
+      <w:r>
+        <w:t>&gt; 当前状态以下列文件为准，本文档不再单独代表最新进度：</w:t>
+      </w:r>
+    </w:p>
+    <w:p>
+      <w:r>
+        <w:t>&gt;</w:t>
+      </w:r>
+    </w:p>
+    <w:p>
+      <w:r>
+        <w:t xml:space="preserve">&gt; - </w:t>
+      </w:r>
+      <w:r>
+        <w:rPr>
+          <w:rFonts w:ascii="Consolas" w:hAnsi="Consolas"/>
+        </w:rPr>
+        <w:t>论文自查表.md</w:t>
+      </w:r>
+      <w:r>
+        <w:t>：66 项检查，62 项通过、4 项部分通过、0 项缺失；含每项的证据文件。</w:t>
+      </w:r>
+    </w:p>
+    <w:p>
+      <w:r>
+        <w:t xml:space="preserve">&gt; - </w:t>
+      </w:r>
+      <w:r>
+        <w:rPr>
+          <w:rFonts w:ascii="Consolas" w:hAnsi="Consolas"/>
+        </w:rPr>
+        <w:t>遗漏问题审查报告.md</w:t>
+      </w:r>
+      <w:r>
+        <w:t>：第一至第十一轮的逐轮记录、发现的问题与处置方式。</w:t>
+      </w:r>
+    </w:p>
+    <w:p>
+      <w:r>
+        <w:t xml:space="preserve">&gt; - </w:t>
+      </w:r>
+      <w:r>
+        <w:rPr>
+          <w:rFonts w:ascii="Consolas" w:hAnsi="Consolas"/>
+        </w:rPr>
+        <w:t>English_SCI_Manuscript_v4.md</w:t>
+      </w:r>
+      <w:r>
+        <w:t xml:space="preserve"> / </w:t>
+      </w:r>
+      <w:r>
+        <w:rPr>
+          <w:rFonts w:ascii="Consolas" w:hAnsi="Consolas"/>
+        </w:rPr>
+        <w:t>中文SCI论文_v4_重构版.md</w:t>
+      </w:r>
+      <w:r>
+        <w:t>：正式稿件，v1.10.0。</w:t>
+      </w:r>
+    </w:p>
+    <w:p>
+      <w:r>
+        <w:t>&gt;</w:t>
+      </w:r>
+    </w:p>
+    <w:p>
+      <w:r>
+        <w:t>&gt; 建议阅读顺序：先看自查表结论 → 再看审查报告对应轮次 → 最后把本文档当作历史任务清单与命令参考。</w:t>
       </w:r>
     </w:p>
     <w:p>

</xml_diff>